<commit_message>
paper: 공개 모델 참고선을 IEIE 초안에 반영 — 학술지판 표 4 신설(PromptMR+ 행 [TBD]) + make_tables.py Table C4 생성기
- make_tables.py: results/eval/baselines_384_full/ per-slice CSV 로부터 Table C4 참고선(볼륨 단위, 순위 표시 없음,
  마지막 열 = SS2D 대비 우위 슬라이스 % SSIM/PSNR) → paper/tables/tableC4_reference.{md,tex} + ieie_table_ref_block.md.
  미완주 방법(7,334 미만)은 자동 [TBD] 셀 — PromptMR+ 완주 후 재실행만으로 확정. 자가검증 VarNet 0.9181·U-Net 0.8971 추가(ALL PASS).
- 학술지판: Ⅳ장 6절 "공개 모델 참고선" 신설(표 4, U-Net† 0.8971 / E2E-VarNet† 0.9181 확정·PromptMR+ [TBD] 중간값 명시),
  표 2 note·정성 비교 말미·보강실험 (4)·고찰 "공개 모델 참고선의 해석" 문단, 표(contrast 5·효율 6)·절 번호 재번호,
  PromptMR+ 서지 xin2024rethinking(ECCV 2024, LNCS 15133) 추가 → 참고문헌 [49]. 구조 점검 FAIL 0.
- 학술대회 2쪽판: 참고선 한 문장 추가 + 분량 트림으로 1.99 쪽 유지.
- docs: frontier_baselines_plan §3-3(U-Net† 09-08 확정·논문 반영), paper_table_conventions §3, CLAUDE.md paper 항목.

Co-Authored-By: Claude Opus 5 (1M context) <noreply@anthropic.com>
Claude-Session: https://claude.ai/code/session_01K9R7kHFdEypGNVHFR6Uhbz
</commit_message>
<xml_diff>
--- a/paper/ieie/draft_ieie_conf_ko_v1.docx
+++ b/paper/ieie/draft_ieie_conf_ko_v1.docx
@@ -459,7 +459,7 @@
           <w:sz w:val="18"/>
           <w:szCs w:val="18"/>
         </w:rPr>
-        <w:t xml:space="preserve">은 후자로, 양방향 GRU(bi-GRU)가 k-space를 영상 도메인 특징으로 변환한 뒤 U-Net이 aliasing을 제거한다. 그러나 bi-GRU는 행·열을 순차 처리해 병렬화가 어렵고 flatten-reshape 구조 탓에 파라미터가 수억 개에 이른다. 선택적 상태공간모델 Mamba</w:t>
+        <w:t xml:space="preserve">은 후자로, 양방향 GRU(bi-GRU)가 k-space를 영상 도메인 특징으로 변환한 뒤 U-Net이 aliasing을 제거한다. 그러나 bi-GRU는 순차 처리라 병렬화가 어렵고 flatten-reshape 구조 탓에 파라미터가 수억 개에 이른다. 상태공간모델 Mamba</w:t>
       </w:r>
       <w:r>
         <w:rPr>
@@ -491,7 +491,7 @@
           <w:sz w:val="18"/>
           <w:szCs w:val="18"/>
         </w:rPr>
-        <w:t xml:space="preserve">는 네 방향 스캔으로 전역 수용영역을 얻는다. Mamba 기반 MRI 재구성</w:t>
+        <w:t xml:space="preserve">는 네 방향 스캔으로 전역 수용영역을 얻는다. 기존 Mamba 기반 MRI 재구성</w:t>
       </w:r>
       <w:r>
         <w:rPr>
@@ -507,7 +507,7 @@
           <w:sz w:val="18"/>
           <w:szCs w:val="18"/>
         </w:rPr>
-        <w:t xml:space="preserve">은 새 구조 전체를 제안하므로 순환신경망만 SSM으로 바꾼 효과를 분리한 통제 비교는 없다. 본 논문은 ETER-Net에서 도메인 변환 시퀀스 모델만 bi-GRU→SS2D로 치환하고 나머지를 모두 고정한 단일 변수 통제 비교를 보고한다.</w:t>
+        <w:t xml:space="preserve">은 새 구조 전체를 제안해, 순환신경망만 SSM으로 바꾼 효과를 분리한 비교는 없다. 본 논문은 ETER-Net에서 도메인 변환 시퀀스 모델만 bi-GRU→SS2D로 치환하고 나머지를 모두 고정한 단일 변수 통제 비교를 보고한다.</w:t>
       </w:r>
     </w:p>
     <w:p>
@@ -574,7 +574,7 @@
           <w:sz w:val="18"/>
           <w:szCs w:val="18"/>
         </w:rPr>
-        <w:t xml:space="preserve">  그림 1은 두 팔이 공유하는 골격이다. 16코일 k-space를 실수·허수로 분리한 (32, 384, 384) 입력을 시퀀스 모델 f_θ가 영상 도메인 특징(20채널)으로 변환하고, zero-filled 코일 영상과 채널 결합해 후처리 U-Net(depth 5, 31.1M)이 magnitude 영상을 출력한다. 손실은 brain mask 내부의 L1+(1−SSIM)이고 data-consistency 블록과 ViT 인코더</w:t>
+        <w:t xml:space="preserve">  그림 1은 두 팔의 공유 골격이다. 16코일 k-space를 실수·허수로 분리한 (32, 384, 384) 입력을 시퀀스 모델 f_θ가 영상 도메인 특징(20채널)으로 변환하고, zero-filled 코일 영상과 채널 결합해 후처리 U-Net(depth 5, 31.1M)이 magnitude 영상을 출력한다. 손실은 brain mask 내부의 L1+(1−SSIM)이고 data-consistency 블록과 ViT 인코더</w:t>
       </w:r>
       <w:r>
         <w:rPr>
@@ -590,7 +590,7 @@
           <w:sz w:val="18"/>
           <w:szCs w:val="18"/>
         </w:rPr>
-        <w:t xml:space="preserve">는 두지 않는다. bi-GRU 팔은 원본의 수평·수직 양방향 GRU(총 668.2M)이며, SS2D 팔은 4방향 selective scan 단일 블록(d_inner 128, d_state 16)으로 출력 채널을 GRU와 같은 20으로 정합해 용량을 GRU 이하로 억제하였다(SSM 스택 0.12M, 총 31.2M). f_θ 외의 데이터로더·마스크·손실·최적화·스케줄·U-Net은 전부 동일하다.</w:t>
+        <w:t xml:space="preserve">는 두지 않는다. bi-GRU 팔은 원본의 수평·수직 양방향 GRU(총 668.2M)이며, SS2D 팔은 4방향 selective scan 단일 블록(d_inner 128, d_state 16)으로 출력 채널을 GRU와 같은 20으로 정합해 용량을 GRU 이하로 억제하였다(SSM 스택 0.12M, 총 31.2M). f_θ 외의 데이터·마스크·손실·최적화·U-Net은 동일하다.</w:t>
       </w:r>
     </w:p>
     <w:p>
@@ -691,7 +691,7 @@
           <w:sz w:val="18"/>
           <w:szCs w:val="18"/>
         </w:rPr>
-        <w:t xml:space="preserve">  강화 SS2D는 통제를 해제한 변형으로 Mamba 게이팅 y·SiLU(z), SS2D 블록 3개의 잔차 스택, 병목 해제(출력 64채널, d_inner 256, d_state 32)를 적용하고, fp16 스캔과 3배 다운샘플 coarse scan으로 epoch당 시간을 통제판 수준으로 유지하였다(약 33M).</w:t>
+        <w:t xml:space="preserve">  강화 SS2D는 통제를 해제한 변형으로 Mamba 게이팅 y·SiLU(z), 3블록 잔차 스택, 병목 해제(출력 64채널, d_inner 256, d_state 32)를 적용하고, fp16 coarse scan(3배 다운샘플)으로 epoch당 시간을 통제판 수준으로 유지하였다(약 33M).</w:t>
       </w:r>
     </w:p>
     <w:p>
@@ -774,7 +774,7 @@
           <w:sz w:val="18"/>
           <w:szCs w:val="18"/>
         </w:rPr>
-        <w:t xml:space="preserve"> 확보 서브셋(혼합 contrast)을 공식 train/val 구획대로 사용하였다(train 65,028 슬라이스, val 464 볼륨/7,334 슬라이스). GT는 RSS 영상의 384×384 crop/pad, 언더샘플링은 R=4 equispaced Cartesian 마스크(ACS 8%)다. Adam(2×10⁻⁴)·cosine annealing·AMP·batch 8·50 epoch(강화판 80)으로 TITAN RTX 24GB 1장에서 학습하였다. 지표는 brain mask 내부 SSIM·PSNR·nMSE(%)를 슬라이스 단위로 계산해 fastMRI 관례대로 볼륨 단위 평균±표준편차로 보고하고(표 1, zero-filled 기준선 포함), paired 설계이므로 우위 슬라이스 비율과 볼륨 단위 Wilcoxon signed-rank 검정으로 유의성을 평가하였다.</w:t>
+        <w:t xml:space="preserve"> 확보 서브셋(혼합 contrast)을 공식 구획대로 사용하였다(train 65,028 슬라이스, val 464 볼륨/7,334 슬라이스). GT는 RSS 영상의 384×384 crop/pad, 언더샘플링은 R=4 equispaced Cartesian 마스크(ACS 8%)다. Adam(2×10⁻⁴)·cosine 스케줄·AMP·batch 8·50 epoch(강화판 80)으로 TITAN RTX 1장에서 학습하였다. 지표는 brain mask 내부 SSIM·PSNR·nMSE(%)를 슬라이스 단위로 계산해 fastMRI 관례대로 볼륨 단위 평균±표준편차로 보고하고(표 1, zero-filled 기준선 포함), paired 설계이므로 우위 슬라이스 비율과 볼륨 단위 Wilcoxon 검정으로 유의성을 평가하였다.</w:t>
       </w:r>
     </w:p>
     <w:p>
@@ -792,7 +792,24 @@
           <w:sz w:val="18"/>
           <w:szCs w:val="18"/>
         </w:rPr>
-        <w:t xml:space="preserve">  표 1과 같이 SS2D 치환은 21배 적은 파라미터로 세 지표 전부에서 원 설계를 앞섰고, paired 비교에서 74~78%의 슬라이스(SSIM 78.2%)와 90~95%의 볼륨에서 우위였다(모든 지표 p&lt;0.001). 우위는 25회의 검증 시점 전부와 5개 contrast 서브그룹 전부(우위 비율 ≥68.7%)에서 유지되었다. 정성적으로 bi-GRU는 두개골 바깥에 수평 방향의 주기적 ringing을 남겼으나 SS2D는 그렇지 않았다. 다만 epoch당 학습시간은 cuDNN GRU가 더 짧아(2.41 h 대 3.07 h) 효율 이점은 파라미터 수에 있다. 강화 SS2D는 통제판 대비 세 지표 모두 근소하게 개선되었으나(우위 슬라이스 54~56%), 이 이득은 동일 50 epoch 시점(SSIM 0.9130)이 아닌 80 epoch 연장 구간에서 발생하였다.</w:t>
+        <w:t xml:space="preserve">  표 1에서 SS2D 치환은 21배 적은 파라미터로 세 지표 전부에서 원 설계를 앞섰고, paired 비교에서 슬라이스 74~78%(SSIM 78.2%)·볼륨 90~95%에서 우위였다(모든 지표 p&lt;0.001). 우위는 25회 검증 시점 전부와 5개 contrast 서브그룹 전부(≥68.7%)에서 유지되었다. 정성적으로 bi-GRU만 두개골 바깥에 주기적 ringing을 남겼다. 다만 epoch당 학습시간은 cuDNN GRU가 짧아(2.41 h 대 3.07 h) 효율 이점은 파라미터 수에 있다. 같은 프로토콜로 전체 검증셋을 추론한 공개 모델은 볼륨 SSIM 기준 U-Net† 0.8971, E2E-VarNet† 0.9181, PromptMR+ </w:t>
+      </w:r>
+      <w:r>
+        <w:rPr>
+          <w:rFonts w:ascii="HY신명조" w:eastAsia="HY신명조" w:hint="eastAsia"/>
+          <w:sz w:val="18"/>
+          <w:szCs w:val="18"/>
+          <w:highlight w:val="yellow"/>
+        </w:rPr>
+        <w:t xml:space="preserve">[TBD]</w:t>
+      </w:r>
+      <w:r>
+        <w:rPr>
+          <w:rFonts w:ascii="HY신명조" w:eastAsia="HY신명조" w:hint="eastAsia"/>
+          <w:sz w:val="18"/>
+          <w:szCs w:val="18"/>
+        </w:rPr>
+        <w:t xml:space="preserve">였다(†: train+val 학습 leaderboard 가중치, 참고선). 강화 SS2D는 통제판 대비 세 지표 모두 근소하게 개선되었으나(우위 슬라이스 54~56%), 이 이득은 동일 50 epoch 시점(SSIM 0.9130)이 아닌 80 epoch 연장 구간의 것이다.</w:t>
       </w:r>
     </w:p>
     <w:p>

</xml_diff>

<commit_message>
paper: 검증 패스 — 강화 SS2D 파라미터 33M→34.2M 정정 + h/ep·wall-clock·Fig.3 문구 정밀화
3층 검증(수치 원천 재계산·상호참조·서술 규칙) 결과 확정 오류 4건 수정:
- 강화 SS2D 총 파라미터 34.2M(SSM 스택 3.1M = 3블록 1.9M + ds 투영 1.2M) — 33M/2M 은
  ds=3 이전 블록만 센 값. make_tables.py 상수 → 표 재생성(변경 셀 = Enhanced params 만)
  → IEIE 학술지판·학술대회판·MDPI 초안·CLAUDE.md·v9 설계문서 정정 노트
- h/ep 각주 "outlier 구간 제외" 삭제(중앙값 2.41/3.07/2.84 는 재시작 구간 포함값)
- wall-clock 문장 = 통제판 best 수준 도달 187 h vs 147 h + 강화판 자체 best ≈221 h 병기
- Fig.3 일치 범위 PSNR 0.31 dB 이내, AXT2 슬라이스 SSIM 동일로 정밀화
docx 재빌드(구조 점검 FAIL 0, 학술대회판 1.99쪽). PromptMR+ [TBD] 는 완주 후 교체.

Co-Authored-By: Claude Opus 5 (1M context) <noreply@anthropic.com>
Claude-Session: https://claude.ai/code/session_01K9R7kHFdEypGNVHFR6Uhbz
</commit_message>
<xml_diff>
--- a/paper/ieie/draft_ieie_conf_ko_v1.docx
+++ b/paper/ieie/draft_ieie_conf_ko_v1.docx
@@ -691,7 +691,7 @@
           <w:sz w:val="18"/>
           <w:szCs w:val="18"/>
         </w:rPr>
-        <w:t xml:space="preserve">  강화 SS2D는 통제를 해제한 변형으로 Mamba 게이팅 y·SiLU(z), 3블록 잔차 스택, 병목 해제(출력 64채널, d_inner 256, d_state 32)를 적용하고, fp16 coarse scan(3배 다운샘플)으로 epoch당 시간을 통제판 수준으로 유지하였다(약 33M).</w:t>
+        <w:t xml:space="preserve">  강화 SS2D는 통제를 해제한 변형으로 Mamba 게이팅 y·SiLU(z), 3블록 잔차 스택, 병목 해제(출력 64채널, d_inner 256, d_state 32)를 적용하고, fp16 coarse scan(3배 다운샘플)으로 epoch당 시간을 통제판 수준으로 유지하였다(약 34M).</w:t>
       </w:r>
     </w:p>
     <w:p>
@@ -1591,7 +1591,7 @@
                 <w:sz w:val="16"/>
                 <w:szCs w:val="16"/>
               </w:rPr>
-              <w:t xml:space="preserve">33</w:t>
+              <w:t xml:space="preserve">34</w:t>
             </w:r>
           </w:p>
         </w:tc>

</xml_diff>